<commit_message>
Anadir contrato de prestacion de servicios profesionales para autonomos
</commit_message>
<xml_diff>
--- a/modelos/compraventa_inmueble.docx
+++ b/modelos/compraventa_inmueble.docx
@@ -141,7 +141,7 @@
         <w:t>SEGUNDA.- PRECIO Y FORMA DE PAGO.</w:t>
       </w:r>
       <w:r>
-        <w:t xml:space="preserve"> El precio total de la presente compraventa se fija en {{ precio_compra_numero }} euros ({{ precio_compra_letras }}), cantidad que la PARTE COMPRADORA satisface a la PARTE VENDEDORA mediante {{ forma_pago }}, sirviendo el presente documento como la más eficaz carta de pago.</w:t>
+        <w:t xml:space="preserve"> El precio total de la presente compraventa se fija en {{ precio_compra_numero }} euros ({{ precio_compra_letras }}), cantidad que la PARTE COMPRADORA satisface a la PARTE VENDEDORA mediante {{ forma_pago }}, sirviendo el presente documento como la mas eficaz carta de pago.</w:t>
       </w:r>
     </w:p>
     <w:p>
@@ -152,7 +152,7 @@
         <w:t>TERCERA.- GASTOS E IMPUESTOS.</w:t>
       </w:r>
       <w:r>
-        <w:t xml:space="preserve"> Los gastos e impuestos derivados de la presente compraventa se satisfarán conforme a lo dispuesto en la legislación vigente, salvo pacto expreso en contrario entre las partes.</w:t>
+        <w:t xml:space="preserve"> Los gastos e impuestos derivados de la presente compraventa se satisfaran conforme a lo dispuesto en la legislacion vigente, salvo pacto expreso en contrario entre las partes.</w:t>
       </w:r>
     </w:p>
     <w:p>

</xml_diff>